<commit_message>
Extract ICT textbook figures and attach them to section master documents
- scripts/extract_textbook_figures.py: crops every captioned figure from the
  Grade 11/12 ICT textbook PDFs (embedded images, drawn diagrams, and
  text-typeset code/table figures), recording page and textbook sub-chapter.
  235 of 237 figures located.
- src/figures/figureMatcher.ts + npm run figures:match: links figures to ICT
  LMS sections. Figure unit = LMS unit; within a unit, sub-chapter heading vs
  section title dominates, figures of one sub-chapter stay together, and
  figure order follows section order. Writes section_figures.json and a
  FIGURE_MAPPING.md review report.
- Master teaching documents (.md/.docx) gain a 'Textbook figures' section with
  the embedded images and captions, for Storyboard @-attach / Docs to video.

Co-Authored-By: Claude Opus 5.5 <noreply@anthropic.com>
</commit_message>
<xml_diff>
--- a/outputs/ict-prepared/Grade_11_ICT_Unit_01_Section_04_master.docx
+++ b/outputs/ict-prepared/Grade_11_ICT_Unit_01_Section_04_master.docx
@@ -635,6 +635,312 @@
           <w:bCs w:val="false"/>
         </w:rPr>
         <w:t xml:space="preserve">Information Quality: The degree to which information meets standards of accuracy, timeliness, completeness, relevance, consistency, and accessibility.</w:t>
+      </w:r>
+    </w:p>
+    <w:p>
+      <w:pPr>
+        <w:pStyle w:val="Heading1"/>
+        <w:spacing w:after="120" w:before="240"/>
+      </w:pPr>
+      <w:r>
+        <w:t xml:space="preserve">TEXTBOOK FIGURES (SHOW THESE IN THE VIDEO)</w:t>
+      </w:r>
+    </w:p>
+    <w:p>
+      <w:pPr>
+        <w:spacing w:after="100"/>
+      </w:pPr>
+      <w:r>
+        <w:rPr>
+          <w:b w:val="false"/>
+          <w:bCs w:val="false"/>
+        </w:rPr>
+        <w:t xml:space="preserve">Use these official textbook figures as on-screen visuals in the scenes that teach the matching concept. Prefer them over stock footage, and keep the figure caption as on-screen text.</w:t>
+      </w:r>
+    </w:p>
+    <w:p>
+      <w:pPr>
+        <w:spacing w:after="40" w:before="120"/>
+      </w:pPr>
+      <w:r>
+        <w:drawing>
+          <wp:inline distT="0" distB="0" distL="0" distR="0">
+            <wp:extent cx="3371850" cy="4438650"/>
+            <wp:effectExtent t="0" r="0" b="0" l="0"/>
+            <wp:docPr id="1" name="Figure 1.1" descr="Different forms of data" title="Figure 1.1"/>
+            <wp:cNvGraphicFramePr>
+              <a:graphicFrameLocks xmlns:a="http://schemas.openxmlformats.org/drawingml/2006/main" noChangeAspect="1"/>
+            </wp:cNvGraphicFramePr>
+            <a:graphic xmlns:a="http://schemas.openxmlformats.org/drawingml/2006/main">
+              <a:graphicData uri="http://schemas.openxmlformats.org/drawingml/2006/picture">
+                <pic:pic xmlns:pic="http://schemas.openxmlformats.org/drawingml/2006/picture">
+                  <pic:nvPicPr>
+                    <pic:cNvPr id="0" name="" descr=""/>
+                    <pic:cNvPicPr>
+                      <a:picLocks noChangeAspect="1" noChangeArrowheads="1"/>
+                    </pic:cNvPicPr>
+                  </pic:nvPicPr>
+                  <pic:blipFill>
+                    <a:blip r:embed="rId7" cstate="none"/>
+                    <a:srcRect/>
+                    <a:stretch>
+                      <a:fillRect/>
+                    </a:stretch>
+                  </pic:blipFill>
+                  <pic:spPr bwMode="auto">
+                    <a:xfrm>
+                      <a:off x="0" y="0"/>
+                      <a:ext cx="3371850" cy="4438650"/>
+                    </a:xfrm>
+                    <a:prstGeom prst="rect">
+                      <a:avLst/>
+                    </a:prstGeom>
+                  </pic:spPr>
+                </pic:pic>
+              </a:graphicData>
+            </a:graphic>
+          </wp:inline>
+        </w:drawing>
+      </w:r>
+    </w:p>
+    <w:p>
+      <w:pPr>
+        <w:spacing w:after="100"/>
+      </w:pPr>
+      <w:r>
+        <w:rPr>
+          <w:b/>
+          <w:bCs/>
+        </w:rPr>
+        <w:t xml:space="preserve">Figure 1.1: Different forms of data (textbook page 8)</w:t>
+      </w:r>
+    </w:p>
+    <w:p>
+      <w:pPr>
+        <w:spacing w:after="40" w:before="120"/>
+      </w:pPr>
+      <w:r>
+        <w:drawing>
+          <wp:inline distT="0" distB="0" distL="0" distR="0">
+            <wp:extent cx="4686300" cy="3752850"/>
+            <wp:effectExtent t="0" r="0" b="0" l="0"/>
+            <wp:docPr id="2" name="Figure 1.2" descr="Different forms of information representation" title="Figure 1.2"/>
+            <wp:cNvGraphicFramePr>
+              <a:graphicFrameLocks xmlns:a="http://schemas.openxmlformats.org/drawingml/2006/main" noChangeAspect="1"/>
+            </wp:cNvGraphicFramePr>
+            <a:graphic xmlns:a="http://schemas.openxmlformats.org/drawingml/2006/main">
+              <a:graphicData uri="http://schemas.openxmlformats.org/drawingml/2006/picture">
+                <pic:pic xmlns:pic="http://schemas.openxmlformats.org/drawingml/2006/picture">
+                  <pic:nvPicPr>
+                    <pic:cNvPr id="0" name="" descr=""/>
+                    <pic:cNvPicPr>
+                      <a:picLocks noChangeAspect="1" noChangeArrowheads="1"/>
+                    </pic:cNvPicPr>
+                  </pic:nvPicPr>
+                  <pic:blipFill>
+                    <a:blip r:embed="rId8" cstate="none"/>
+                    <a:srcRect/>
+                    <a:stretch>
+                      <a:fillRect/>
+                    </a:stretch>
+                  </pic:blipFill>
+                  <pic:spPr bwMode="auto">
+                    <a:xfrm>
+                      <a:off x="0" y="0"/>
+                      <a:ext cx="4686300" cy="3752850"/>
+                    </a:xfrm>
+                    <a:prstGeom prst="rect">
+                      <a:avLst/>
+                    </a:prstGeom>
+                  </pic:spPr>
+                </pic:pic>
+              </a:graphicData>
+            </a:graphic>
+          </wp:inline>
+        </w:drawing>
+      </w:r>
+    </w:p>
+    <w:p>
+      <w:pPr>
+        <w:spacing w:after="100"/>
+      </w:pPr>
+      <w:r>
+        <w:rPr>
+          <w:b/>
+          <w:bCs/>
+        </w:rPr>
+        <w:t xml:space="preserve">Figure 1.2: Different forms of information representation (textbook page 9)</w:t>
+      </w:r>
+    </w:p>
+    <w:p>
+      <w:pPr>
+        <w:spacing w:after="40" w:before="120"/>
+      </w:pPr>
+      <w:r>
+        <w:drawing>
+          <wp:inline distT="0" distB="0" distL="0" distR="0">
+            <wp:extent cx="5210175" cy="5219700"/>
+            <wp:effectExtent t="0" r="0" b="0" l="0"/>
+            <wp:docPr id="3" name="Figure 1.3" descr="Example of knowledge acquisition" title="Figure 1.3"/>
+            <wp:cNvGraphicFramePr>
+              <a:graphicFrameLocks xmlns:a="http://schemas.openxmlformats.org/drawingml/2006/main" noChangeAspect="1"/>
+            </wp:cNvGraphicFramePr>
+            <a:graphic xmlns:a="http://schemas.openxmlformats.org/drawingml/2006/main">
+              <a:graphicData uri="http://schemas.openxmlformats.org/drawingml/2006/picture">
+                <pic:pic xmlns:pic="http://schemas.openxmlformats.org/drawingml/2006/picture">
+                  <pic:nvPicPr>
+                    <pic:cNvPr id="0" name="" descr=""/>
+                    <pic:cNvPicPr>
+                      <a:picLocks noChangeAspect="1" noChangeArrowheads="1"/>
+                    </pic:cNvPicPr>
+                  </pic:nvPicPr>
+                  <pic:blipFill>
+                    <a:blip r:embed="rId9" cstate="none"/>
+                    <a:srcRect/>
+                    <a:stretch>
+                      <a:fillRect/>
+                    </a:stretch>
+                  </pic:blipFill>
+                  <pic:spPr bwMode="auto">
+                    <a:xfrm>
+                      <a:off x="0" y="0"/>
+                      <a:ext cx="5210175" cy="5219700"/>
+                    </a:xfrm>
+                    <a:prstGeom prst="rect">
+                      <a:avLst/>
+                    </a:prstGeom>
+                  </pic:spPr>
+                </pic:pic>
+              </a:graphicData>
+            </a:graphic>
+          </wp:inline>
+        </w:drawing>
+      </w:r>
+    </w:p>
+    <w:p>
+      <w:pPr>
+        <w:spacing w:after="100"/>
+      </w:pPr>
+      <w:r>
+        <w:rPr>
+          <w:b/>
+          <w:bCs/>
+        </w:rPr>
+        <w:t xml:space="preserve">Figure 1.3: Example of knowledge acquisition (textbook page 10)</w:t>
+      </w:r>
+    </w:p>
+    <w:p>
+      <w:pPr>
+        <w:spacing w:after="40" w:before="120"/>
+      </w:pPr>
+      <w:r>
+        <w:drawing>
+          <wp:inline distT="0" distB="0" distL="0" distR="0">
+            <wp:extent cx="4676775" cy="3752850"/>
+            <wp:effectExtent t="0" r="0" b="0" l="0"/>
+            <wp:docPr id="4" name="Figure 1.4" descr="Wisdom" title="Figure 1.4"/>
+            <wp:cNvGraphicFramePr>
+              <a:graphicFrameLocks xmlns:a="http://schemas.openxmlformats.org/drawingml/2006/main" noChangeAspect="1"/>
+            </wp:cNvGraphicFramePr>
+            <a:graphic xmlns:a="http://schemas.openxmlformats.org/drawingml/2006/main">
+              <a:graphicData uri="http://schemas.openxmlformats.org/drawingml/2006/picture">
+                <pic:pic xmlns:pic="http://schemas.openxmlformats.org/drawingml/2006/picture">
+                  <pic:nvPicPr>
+                    <pic:cNvPr id="0" name="" descr=""/>
+                    <pic:cNvPicPr>
+                      <a:picLocks noChangeAspect="1" noChangeArrowheads="1"/>
+                    </pic:cNvPicPr>
+                  </pic:nvPicPr>
+                  <pic:blipFill>
+                    <a:blip r:embed="rId10" cstate="none"/>
+                    <a:srcRect/>
+                    <a:stretch>
+                      <a:fillRect/>
+                    </a:stretch>
+                  </pic:blipFill>
+                  <pic:spPr bwMode="auto">
+                    <a:xfrm>
+                      <a:off x="0" y="0"/>
+                      <a:ext cx="4676775" cy="3752850"/>
+                    </a:xfrm>
+                    <a:prstGeom prst="rect">
+                      <a:avLst/>
+                    </a:prstGeom>
+                  </pic:spPr>
+                </pic:pic>
+              </a:graphicData>
+            </a:graphic>
+          </wp:inline>
+        </w:drawing>
+      </w:r>
+    </w:p>
+    <w:p>
+      <w:pPr>
+        <w:spacing w:after="100"/>
+      </w:pPr>
+      <w:r>
+        <w:rPr>
+          <w:b/>
+          <w:bCs/>
+        </w:rPr>
+        <w:t xml:space="preserve">Figure 1.4: Wisdom (textbook page 10)</w:t>
+      </w:r>
+    </w:p>
+    <w:p>
+      <w:pPr>
+        <w:spacing w:after="40" w:before="120"/>
+      </w:pPr>
+      <w:r>
+        <w:drawing>
+          <wp:inline distT="0" distB="0" distL="0" distR="0">
+            <wp:extent cx="5334000" cy="3952875"/>
+            <wp:effectExtent t="0" r="0" b="0" l="0"/>
+            <wp:docPr id="5" name="Figure 1.5" descr="Data, Information, Knowledge and Wisdom" title="Figure 1.5"/>
+            <wp:cNvGraphicFramePr>
+              <a:graphicFrameLocks xmlns:a="http://schemas.openxmlformats.org/drawingml/2006/main" noChangeAspect="1"/>
+            </wp:cNvGraphicFramePr>
+            <a:graphic xmlns:a="http://schemas.openxmlformats.org/drawingml/2006/main">
+              <a:graphicData uri="http://schemas.openxmlformats.org/drawingml/2006/picture">
+                <pic:pic xmlns:pic="http://schemas.openxmlformats.org/drawingml/2006/picture">
+                  <pic:nvPicPr>
+                    <pic:cNvPr id="0" name="" descr=""/>
+                    <pic:cNvPicPr>
+                      <a:picLocks noChangeAspect="1" noChangeArrowheads="1"/>
+                    </pic:cNvPicPr>
+                  </pic:nvPicPr>
+                  <pic:blipFill>
+                    <a:blip r:embed="rId11" cstate="none"/>
+                    <a:srcRect/>
+                    <a:stretch>
+                      <a:fillRect/>
+                    </a:stretch>
+                  </pic:blipFill>
+                  <pic:spPr bwMode="auto">
+                    <a:xfrm>
+                      <a:off x="0" y="0"/>
+                      <a:ext cx="5334000" cy="3952875"/>
+                    </a:xfrm>
+                    <a:prstGeom prst="rect">
+                      <a:avLst/>
+                    </a:prstGeom>
+                  </pic:spPr>
+                </pic:pic>
+              </a:graphicData>
+            </a:graphic>
+          </wp:inline>
+        </w:drawing>
+      </w:r>
+    </w:p>
+    <w:p>
+      <w:pPr>
+        <w:spacing w:after="100"/>
+      </w:pPr>
+      <w:r>
+        <w:rPr>
+          <w:b/>
+          <w:bCs/>
+        </w:rPr>
+        <w:t xml:space="preserve">Figure 1.5: Data, Information, Knowledge and Wisdom (textbook page 11)</w:t>
       </w:r>
     </w:p>
     <w:p>

</xml_diff>